<commit_message>
Integrate live web app URL (danielaristo.com/reference-integrity-checker) into manuscript
</commit_message>
<xml_diff>
--- a/Manuscrito_Referencias_Alucinadas_v0.1.docx
+++ b/Manuscrito_Referencias_Alucinadas_v0.1.docx
@@ -251,7 +251,7 @@
           <w:i w:val="0"/>
           <w:sz w:val="22"/>
         </w:rPr>
-        <w:t>, we release the verification tool, the annotated survivor set, and all code and data openly, so that authors, editors, and reviewers can screen bibliographies before publication.</w:t>
+        <w:t>, we release the verification tool as a free web application (danielaristo.com/reference-integrity-checker), together with the annotated survivor set and all code and data, so that authors, editors, and reviewers can screen bibliographies before publication.</w:t>
       </w:r>
     </w:p>
     <w:p>
@@ -552,6 +552,44 @@
           <w:sz w:val="22"/>
         </w:rPr>
         <w:t>All three databases are queried through free public APIs; no proprietary index is used. The verification code, the sampled references with provenance, and the annotated survivor set are openly available at the repository listed above.</w:t>
+      </w:r>
+    </w:p>
+    <w:p>
+      <w:pPr>
+        <w:pStyle w:val="Heading2"/>
+      </w:pPr>
+      <w:r>
+        <w:t>2.7 A public screening tool</w:t>
+      </w:r>
+    </w:p>
+    <w:p>
+      <w:pPr>
+        <w:spacing w:after="140"/>
+        <w:jc w:val="both"/>
+      </w:pPr>
+      <w:r>
+        <w:rPr>
+          <w:b w:val="0"/>
+          <w:i w:val="0"/>
+          <w:sz w:val="22"/>
+        </w:rPr>
+        <w:t xml:space="preserve">Stages 1–2 of the cascade (Crossref and OpenAlex) require no proprietary access and both APIs permit cross-origin requests, so we implemented them as a client-side web application that runs entirely in the user's browser: no reference text is transmitted to any server other than the two source databases themselves. The tool is freely available at </w:t>
+      </w:r>
+      <w:r>
+        <w:rPr>
+          <w:b/>
+          <w:i w:val="0"/>
+          <w:sz w:val="22"/>
+        </w:rPr>
+        <w:t>danielaristo.com/reference-integrity-checker</w:t>
+      </w:r>
+      <w:r>
+        <w:rPr>
+          <w:b w:val="0"/>
+          <w:i w:val="0"/>
+          <w:sz w:val="22"/>
+        </w:rPr>
+        <w:t xml:space="preserve"> and lets an author, editor, or reviewer paste a bibliography and receive a per-reference verdict (verified, metadata mismatch, retracted, or not verifiable) in seconds, with a CSV export for manuscript records. The full four-source cascade with Semantic Scholar and human review, as used for the results below, is available as the open-source command-line pipeline in the same repository.</w:t>
       </w:r>
     </w:p>
     <w:p>
@@ -1989,7 +2027,39 @@
           <w:i w:val="0"/>
           <w:sz w:val="22"/>
         </w:rPr>
-        <w:t>The verification code, the 5,000 sampled references with citing-article provenance, the full cascade output, and the annotated 101-reference survivor set are openly available at github.com/danielaristo/reference-integrity-checker.</w:t>
+        <w:t xml:space="preserve">The verification code, the 5,000 sampled references with citing-article provenance, the full cascade output, and the annotated 101-reference survivor set are openly available at </w:t>
+      </w:r>
+      <w:r>
+        <w:rPr>
+          <w:b/>
+          <w:i w:val="0"/>
+          <w:sz w:val="22"/>
+        </w:rPr>
+        <w:t>github.com/danielaristo/reference-integrity-checker</w:t>
+      </w:r>
+      <w:r>
+        <w:rPr>
+          <w:b w:val="0"/>
+          <w:i w:val="0"/>
+          <w:sz w:val="22"/>
+        </w:rPr>
+        <w:t xml:space="preserve">. A free, no-installation web application implementing Stages 1–2 of the cascade is publicly available at </w:t>
+      </w:r>
+      <w:r>
+        <w:rPr>
+          <w:b/>
+          <w:i w:val="0"/>
+          <w:sz w:val="22"/>
+        </w:rPr>
+        <w:t>danielaristo.com/reference-integrity-checker</w:t>
+      </w:r>
+      <w:r>
+        <w:rPr>
+          <w:b w:val="0"/>
+          <w:i w:val="0"/>
+          <w:sz w:val="22"/>
+        </w:rPr>
+        <w:t xml:space="preserve"> for authors, editors, and reviewers to screen bibliographies before publication.</w:t>
       </w:r>
     </w:p>
     <w:p>

</xml_diff>

<commit_message>
Deepen web app integration in manuscript
- Expand 2.7 with architecture details and a new Table 3 mapping the
  tool's four verdict badges to the Section 2.5 taxonomy
- Add 4.1 "From finding to practice: a deployed tool", tying the
  rate-limit honesty fix to the paper's central thesis
- Renumber former 4.1 Limitations -> 4.2
</commit_message>
<xml_diff>
--- a/Manuscrito_Referencias_Alucinadas_v0.1.docx
+++ b/Manuscrito_Referencias_Alucinadas_v0.1.docx
@@ -573,7 +573,7 @@
           <w:i w:val="0"/>
           <w:sz w:val="22"/>
         </w:rPr>
-        <w:t xml:space="preserve">Stages 1–2 of the cascade (Crossref and OpenAlex) require no proprietary access and both APIs permit cross-origin requests, so we implemented them as a client-side web application that runs entirely in the user's browser: no reference text is transmitted to any server other than the two source databases themselves. The tool is freely available at </w:t>
+        <w:t xml:space="preserve">Stages 1–2 of the cascade (Crossref and OpenAlex) require no proprietary access and both APIs permit cross-origin requests, so we implemented them as a client-side web application that runs entirely in the user's browser: no reference text is transmitted to any server other than the two source databases themselves, and no installation, account, or payment is required. The tool is freely available at </w:t>
       </w:r>
       <w:r>
         <w:rPr>
@@ -589,7 +589,371 @@
           <w:i w:val="0"/>
           <w:sz w:val="22"/>
         </w:rPr>
-        <w:t xml:space="preserve"> and lets an author, editor, or reviewer paste a bibliography and receive a per-reference verdict (verified, metadata mismatch, retracted, or not verifiable) in seconds, with a CSV export for manuscript records. The full four-source cascade with Semantic Scholar and human review, as used for the results below, is available as the open-source command-line pipeline in the same repository.</w:t>
+        <w:t xml:space="preserve"> and lets an author, editor, or reviewer paste a bibliography and receive a per-reference verdict in seconds, with a CSV export for manuscript records. Table 3 maps the tool's four verdict states to the taxonomy of Section 2.5. The full four-source cascade with Semantic Scholar and exhaustive human review, as used for the results reported below, remains available as the open-source command-line pipeline in the same repository, since the Semantic Scholar layer requires an API key that cannot be safely embedded in client-side code.</w:t>
+      </w:r>
+    </w:p>
+    <w:p>
+      <w:pPr>
+        <w:spacing w:after="80"/>
+        <w:jc w:val="both"/>
+      </w:pPr>
+      <w:r>
+        <w:rPr>
+          <w:b w:val="0"/>
+          <w:i/>
+          <w:sz w:val="19"/>
+        </w:rPr>
+        <w:t>Table 3. Verdict states exposed by the public web tool.</w:t>
+      </w:r>
+    </w:p>
+    <w:tbl>
+      <w:tblPr>
+        <w:tblW w:type="auto" w:w="0"/>
+        <w:jc w:val="center"/>
+        <w:tblLayout w:type="fixed"/>
+        <w:tblLook w:firstColumn="1" w:firstRow="1" w:lastColumn="0" w:lastRow="0" w:noHBand="0" w:noVBand="1" w:val="04A0"/>
+        <w:tblBorders>
+          <w:top w:val="single" w:sz="4" w:color="BFBFBF"/>
+          <w:left w:val="single" w:sz="4" w:color="BFBFBF"/>
+          <w:bottom w:val="single" w:sz="4" w:color="BFBFBF"/>
+          <w:right w:val="single" w:sz="4" w:color="BFBFBF"/>
+          <w:insideH w:val="single" w:sz="4" w:color="BFBFBF"/>
+          <w:insideV w:val="single" w:sz="4" w:color="BFBFBF"/>
+        </w:tblBorders>
+      </w:tblPr>
+      <w:tblGrid>
+        <w:gridCol w:w="2880"/>
+        <w:gridCol w:w="2880"/>
+        <w:gridCol w:w="2880"/>
+      </w:tblGrid>
+      <w:tr>
+        <w:tc>
+          <w:tcPr>
+            <w:tcW w:type="dxa" w:w="2160"/>
+            <w:shd w:val="clear" w:fill="1F4E79"/>
+          </w:tcPr>
+          <w:p>
+            <w:pPr>
+              <w:spacing w:after="0"/>
+            </w:pPr>
+            <w:r/>
+            <w:r>
+              <w:rPr>
+                <w:b/>
+                <w:color w:val="FFFFFF"/>
+                <w:sz w:val="19"/>
+              </w:rPr>
+              <w:t>Tool badge</w:t>
+            </w:r>
+          </w:p>
+        </w:tc>
+        <w:tc>
+          <w:tcPr>
+            <w:tcW w:type="dxa" w:w="3312"/>
+            <w:shd w:val="clear" w:fill="1F4E79"/>
+          </w:tcPr>
+          <w:p>
+            <w:pPr>
+              <w:spacing w:after="0"/>
+            </w:pPr>
+            <w:r/>
+            <w:r>
+              <w:rPr>
+                <w:b/>
+                <w:color w:val="FFFFFF"/>
+                <w:sz w:val="19"/>
+              </w:rPr>
+              <w:t>Taxonomy class (§2.5)</w:t>
+            </w:r>
+          </w:p>
+        </w:tc>
+        <w:tc>
+          <w:tcPr>
+            <w:tcW w:type="dxa" w:w="4464"/>
+            <w:shd w:val="clear" w:fill="1F4E79"/>
+          </w:tcPr>
+          <w:p>
+            <w:pPr>
+              <w:spacing w:after="0"/>
+            </w:pPr>
+            <w:r/>
+            <w:r>
+              <w:rPr>
+                <w:b/>
+                <w:color w:val="FFFFFF"/>
+                <w:sz w:val="19"/>
+              </w:rPr>
+              <w:t>Meaning</w:t>
+            </w:r>
+          </w:p>
+        </w:tc>
+      </w:tr>
+      <w:tr>
+        <w:tc>
+          <w:tcPr>
+            <w:tcW w:type="dxa" w:w="2160"/>
+          </w:tcPr>
+          <w:p>
+            <w:pPr>
+              <w:spacing w:after="0"/>
+            </w:pPr>
+            <w:r/>
+            <w:r>
+              <w:rPr>
+                <w:b w:val="0"/>
+                <w:sz w:val="19"/>
+              </w:rPr>
+              <w:t>Verified</w:t>
+            </w:r>
+          </w:p>
+        </w:tc>
+        <w:tc>
+          <w:tcPr>
+            <w:tcW w:type="dxa" w:w="3312"/>
+          </w:tcPr>
+          <w:p>
+            <w:pPr>
+              <w:spacing w:after="0"/>
+            </w:pPr>
+            <w:r/>
+            <w:r>
+              <w:rPr>
+                <w:b w:val="0"/>
+                <w:sz w:val="19"/>
+              </w:rPr>
+              <w:t>Recoverable / confirmed existing</w:t>
+            </w:r>
+          </w:p>
+        </w:tc>
+        <w:tc>
+          <w:tcPr>
+            <w:tcW w:type="dxa" w:w="4464"/>
+          </w:tcPr>
+          <w:p>
+            <w:pPr>
+              <w:spacing w:after="0"/>
+            </w:pPr>
+            <w:r/>
+            <w:r>
+              <w:rPr>
+                <w:b w:val="0"/>
+                <w:sz w:val="19"/>
+              </w:rPr>
+              <w:t>Found in Crossref or OpenAlex with matching metadata; DOI link provided</w:t>
+            </w:r>
+          </w:p>
+        </w:tc>
+      </w:tr>
+      <w:tr>
+        <w:tc>
+          <w:tcPr>
+            <w:tcW w:type="dxa" w:w="2160"/>
+          </w:tcPr>
+          <w:p>
+            <w:pPr>
+              <w:spacing w:after="0"/>
+            </w:pPr>
+            <w:r/>
+            <w:r>
+              <w:rPr>
+                <w:b w:val="0"/>
+                <w:sz w:val="19"/>
+              </w:rPr>
+              <w:t>Metadata issue</w:t>
+            </w:r>
+          </w:p>
+        </w:tc>
+        <w:tc>
+          <w:tcPr>
+            <w:tcW w:type="dxa" w:w="3312"/>
+          </w:tcPr>
+          <w:p>
+            <w:pPr>
+              <w:spacing w:after="0"/>
+            </w:pPr>
+            <w:r/>
+            <w:r>
+              <w:rPr>
+                <w:b w:val="0"/>
+                <w:sz w:val="19"/>
+              </w:rPr>
+              <w:t>Erroneous</w:t>
+            </w:r>
+          </w:p>
+        </w:tc>
+        <w:tc>
+          <w:tcPr>
+            <w:tcW w:type="dxa" w:w="4464"/>
+          </w:tcPr>
+          <w:p>
+            <w:pPr>
+              <w:spacing w:after="0"/>
+            </w:pPr>
+            <w:r/>
+            <w:r>
+              <w:rPr>
+                <w:b w:val="0"/>
+                <w:sz w:val="19"/>
+              </w:rPr>
+              <w:t>Found, but the cited year differs from the registered year by more than two</w:t>
+            </w:r>
+          </w:p>
+        </w:tc>
+      </w:tr>
+      <w:tr>
+        <w:tc>
+          <w:tcPr>
+            <w:tcW w:type="dxa" w:w="2160"/>
+          </w:tcPr>
+          <w:p>
+            <w:pPr>
+              <w:spacing w:after="0"/>
+            </w:pPr>
+            <w:r/>
+            <w:r>
+              <w:rPr>
+                <w:b w:val="0"/>
+                <w:sz w:val="19"/>
+              </w:rPr>
+              <w:t>Retracted</w:t>
+            </w:r>
+          </w:p>
+        </w:tc>
+        <w:tc>
+          <w:tcPr>
+            <w:tcW w:type="dxa" w:w="3312"/>
+          </w:tcPr>
+          <w:p>
+            <w:pPr>
+              <w:spacing w:after="0"/>
+            </w:pPr>
+            <w:r/>
+            <w:r>
+              <w:rPr>
+                <w:b w:val="0"/>
+                <w:sz w:val="19"/>
+              </w:rPr>
+              <w:t>Retracted</w:t>
+            </w:r>
+          </w:p>
+        </w:tc>
+        <w:tc>
+          <w:tcPr>
+            <w:tcW w:type="dxa" w:w="4464"/>
+          </w:tcPr>
+          <w:p>
+            <w:pPr>
+              <w:spacing w:after="0"/>
+            </w:pPr>
+            <w:r/>
+            <w:r>
+              <w:rPr>
+                <w:b w:val="0"/>
+                <w:sz w:val="19"/>
+              </w:rPr>
+              <w:t>OpenAlex marks the work as retracted (checked by DOI and by title)</w:t>
+            </w:r>
+          </w:p>
+        </w:tc>
+      </w:tr>
+      <w:tr>
+        <w:tc>
+          <w:tcPr>
+            <w:tcW w:type="dxa" w:w="2160"/>
+          </w:tcPr>
+          <w:p>
+            <w:pPr>
+              <w:spacing w:after="0"/>
+            </w:pPr>
+            <w:r/>
+            <w:r>
+              <w:rPr>
+                <w:b w:val="0"/>
+                <w:sz w:val="19"/>
+              </w:rPr>
+              <w:t>Not verifiable</w:t>
+            </w:r>
+          </w:p>
+        </w:tc>
+        <w:tc>
+          <w:tcPr>
+            <w:tcW w:type="dxa" w:w="3312"/>
+          </w:tcPr>
+          <w:p>
+            <w:pPr>
+              <w:spacing w:after="0"/>
+            </w:pPr>
+            <w:r/>
+            <w:r>
+              <w:rPr>
+                <w:b w:val="0"/>
+                <w:sz w:val="19"/>
+              </w:rPr>
+              <w:t>Non-indexed / candidate fabrication</w:t>
+            </w:r>
+          </w:p>
+        </w:tc>
+        <w:tc>
+          <w:tcPr>
+            <w:tcW w:type="dxa" w:w="4464"/>
+          </w:tcPr>
+          <w:p>
+            <w:pPr>
+              <w:spacing w:after="0"/>
+            </w:pPr>
+            <w:r/>
+            <w:r>
+              <w:rPr>
+                <w:b w:val="0"/>
+                <w:sz w:val="19"/>
+              </w:rPr>
+              <w:t>Absent from both databases — a prompt for manual review, not a verdict</w:t>
+            </w:r>
+          </w:p>
+        </w:tc>
+      </w:tr>
+    </w:tbl>
+    <w:p>
+      <w:pPr>
+        <w:spacing w:after="80"/>
+        <w:jc w:val="both"/>
+      </w:pPr>
+      <w:r>
+        <w:rPr>
+          <w:b w:val="0"/>
+          <w:i w:val="0"/>
+          <w:sz w:val="22"/>
+        </w:rPr>
+      </w:r>
+    </w:p>
+    <w:p>
+      <w:pPr>
+        <w:spacing w:after="140"/>
+        <w:jc w:val="both"/>
+      </w:pPr>
+      <w:r>
+        <w:rPr>
+          <w:b w:val="0"/>
+          <w:i w:val="0"/>
+          <w:sz w:val="22"/>
+        </w:rPr>
+        <w:t xml:space="preserve">A deployment finding is worth reporting on its own terms. During live testing we identified a failure mode in which a rate-limited (HTTP 429) response from OpenAlex was silently treated as a confirmed </w:t>
+      </w:r>
+      <w:r>
+        <w:rPr>
+          <w:b w:val="0"/>
+          <w:i/>
+          <w:sz w:val="22"/>
+        </w:rPr>
+        <w:t>not retracted</w:t>
+      </w:r>
+      <w:r>
+        <w:rPr>
+          <w:b w:val="0"/>
+          <w:i w:val="0"/>
+          <w:sz w:val="22"/>
+        </w:rPr>
+        <w:t xml:space="preserve"> result, rather than as a failed check — precisely the kind of false negative this study warns against. We revised the tool so that a failed retraction check is reported to the user explicitly ("retraction status could not be confirmed — verify manually") rather than defaulting to a clean verdict. We surface this not as a footnote but as a design principle: a screening tool must fail loudly, not silently, and we regard this fix as a direct, practical instantiation of the paper's central argument in Section 4.</w:t>
       </w:r>
     </w:p>
     <w:p>
@@ -1935,7 +2299,45 @@
         <w:pStyle w:val="Heading2"/>
       </w:pPr>
       <w:r>
-        <w:t>4.1 Limitations</w:t>
+        <w:t>4.1 From finding to practice: a deployed tool</w:t>
+      </w:r>
+    </w:p>
+    <w:p>
+      <w:pPr>
+        <w:spacing w:after="140"/>
+        <w:jc w:val="both"/>
+      </w:pPr>
+      <w:r>
+        <w:rPr>
+          <w:b w:val="0"/>
+          <w:i w:val="0"/>
+          <w:sz w:val="22"/>
+        </w:rPr>
+        <w:t xml:space="preserve">Unlike the prevalence estimate, which we report as an upper bound pending a larger study (Section 3.5), the screening tool described in Section 2.7 is a concrete, immediately usable artifact: it is live, free, and requires no infrastructure beyond a browser. We consider this an important complement to the empirical finding rather than a secondary output. A tool that reports a raw </w:t>
+      </w:r>
+      <w:r>
+        <w:rPr>
+          <w:b w:val="0"/>
+          <w:i/>
+          <w:sz w:val="22"/>
+        </w:rPr>
+        <w:t>not found</w:t>
+      </w:r>
+      <w:r>
+        <w:rPr>
+          <w:b w:val="0"/>
+          <w:i w:val="0"/>
+          <w:sz w:val="22"/>
+        </w:rPr>
+        <w:t xml:space="preserve"> as a confident verdict — as ours briefly did, before the fix described in Section 2.7 — reproduces at implementation level the exact conflation this paper argues against at the analytical level. Making that failure mode visible, and fixing it under real operating conditions (including genuine upstream rate limiting, not a simulated one), is evidence that the taxonomy proposed here is not only descriptively useful but operationally enforceable.</w:t>
+      </w:r>
+    </w:p>
+    <w:p>
+      <w:pPr>
+        <w:pStyle w:val="Heading2"/>
+      </w:pPr>
+      <w:r>
+        <w:t>4.2 Limitations</w:t>
       </w:r>
     </w:p>
     <w:p>

</xml_diff>

<commit_message>
Embed live tool screenshots as Figures 1-2 in the manuscript
Figure 1 shows the tool's input screen; Figure 2 shows real output on
the seven-reference test set, captured during genuine OpenAlex rate
limiting — it visibly demonstrates the honest-uncertainty behavior
described in the new deployment-finding paragraph (Section 2.7),
rather than a staged "clean" demo.
</commit_message>
<xml_diff>
--- a/Manuscrito_Referencias_Alucinadas_v0.1.docx
+++ b/Manuscrito_Referencias_Alucinadas_v0.1.docx
@@ -594,6 +594,60 @@
     </w:p>
     <w:p>
       <w:pPr>
+        <w:spacing w:before="120"/>
+        <w:jc w:val="center"/>
+      </w:pPr>
+      <w:r>
+        <w:drawing>
+          <wp:inline xmlns:a="http://schemas.openxmlformats.org/drawingml/2006/main" xmlns:pic="http://schemas.openxmlformats.org/drawingml/2006/picture">
+            <wp:extent cx="5120640" cy="2959106"/>
+            <wp:docPr id="1" name="Picture 1"/>
+            <wp:cNvGraphicFramePr>
+              <a:graphicFrameLocks noChangeAspect="1"/>
+            </wp:cNvGraphicFramePr>
+            <a:graphic>
+              <a:graphicData uri="http://schemas.openxmlformats.org/drawingml/2006/picture">
+                <pic:pic>
+                  <pic:nvPicPr>
+                    <pic:cNvPr id="0" name="captura_app_2.png"/>
+                    <pic:cNvPicPr/>
+                  </pic:nvPicPr>
+                  <pic:blipFill>
+                    <a:blip r:embed="rId9"/>
+                    <a:stretch>
+                      <a:fillRect/>
+                    </a:stretch>
+                  </pic:blipFill>
+                  <pic:spPr>
+                    <a:xfrm>
+                      <a:off x="0" y="0"/>
+                      <a:ext cx="5120640" cy="2959106"/>
+                    </a:xfrm>
+                    <a:prstGeom prst="rect"/>
+                  </pic:spPr>
+                </pic:pic>
+              </a:graphicData>
+            </a:graphic>
+          </wp:inline>
+        </w:drawing>
+      </w:r>
+    </w:p>
+    <w:p>
+      <w:pPr>
+        <w:spacing w:after="200"/>
+        <w:jc w:val="center"/>
+      </w:pPr>
+      <w:r>
+        <w:rPr>
+          <w:i/>
+          <w:color w:val="595959"/>
+          <w:sz w:val="19"/>
+        </w:rPr>
+        <w:t>Figure 1. The public web tool (danielaristo.com/reference-integrity-checker). References are pasted one per line; verification runs entirely client-side against Crossref and OpenAlex.</w:t>
+      </w:r>
+    </w:p>
+    <w:p>
+      <w:pPr>
         <w:spacing w:after="80"/>
         <w:jc w:val="both"/>
       </w:pPr>
@@ -928,6 +982,60 @@
     </w:p>
     <w:p>
       <w:pPr>
+        <w:spacing w:before="120"/>
+        <w:jc w:val="center"/>
+      </w:pPr>
+      <w:r>
+        <w:drawing>
+          <wp:inline xmlns:a="http://schemas.openxmlformats.org/drawingml/2006/main" xmlns:pic="http://schemas.openxmlformats.org/drawingml/2006/picture">
+            <wp:extent cx="5120640" cy="3917172"/>
+            <wp:docPr id="2" name="Picture 2"/>
+            <wp:cNvGraphicFramePr>
+              <a:graphicFrameLocks noChangeAspect="1"/>
+            </wp:cNvGraphicFramePr>
+            <a:graphic>
+              <a:graphicData uri="http://schemas.openxmlformats.org/drawingml/2006/picture">
+                <pic:pic>
+                  <pic:nvPicPr>
+                    <pic:cNvPr id="0" name="captura_app_1.png"/>
+                    <pic:cNvPicPr/>
+                  </pic:nvPicPr>
+                  <pic:blipFill>
+                    <a:blip r:embed="rId10"/>
+                    <a:stretch>
+                      <a:fillRect/>
+                    </a:stretch>
+                  </pic:blipFill>
+                  <pic:spPr>
+                    <a:xfrm>
+                      <a:off x="0" y="0"/>
+                      <a:ext cx="5120640" cy="3917172"/>
+                    </a:xfrm>
+                    <a:prstGeom prst="rect"/>
+                  </pic:spPr>
+                </pic:pic>
+              </a:graphicData>
+            </a:graphic>
+          </wp:inline>
+        </w:drawing>
+      </w:r>
+    </w:p>
+    <w:p>
+      <w:pPr>
+        <w:spacing w:after="200"/>
+        <w:jc w:val="center"/>
+      </w:pPr>
+      <w:r>
+        <w:rPr>
+          <w:i/>
+          <w:color w:val="595959"/>
+          <w:sz w:val="19"/>
+        </w:rPr>
+        <w:t>Figure 2. Output of the public tool on the seven-reference test set of Section 2.3, captured during a period of sustained upstream rate limiting from OpenAlex. Rather than silently defaulting to a clean verdict, the tool reports explicitly that the retraction check could not be confirmed (see annotation under the first result) — the deployment finding discussed below.</w:t>
+      </w:r>
+    </w:p>
+    <w:p>
+      <w:pPr>
         <w:spacing w:after="140"/>
         <w:jc w:val="both"/>
       </w:pPr>
@@ -937,7 +1045,7 @@
           <w:i w:val="0"/>
           <w:sz w:val="22"/>
         </w:rPr>
-        <w:t xml:space="preserve">A deployment finding is worth reporting on its own terms. During live testing we identified a failure mode in which a rate-limited (HTTP 429) response from OpenAlex was silently treated as a confirmed </w:t>
+        <w:t xml:space="preserve">A deployment finding is worth reporting on its own terms. During live testing (Figure 2) we identified a failure mode in which a rate-limited (HTTP 429) response from OpenAlex was silently treated as a confirmed </w:t>
       </w:r>
       <w:r>
         <w:rPr>

</xml_diff>

<commit_message>
Point live tool references to new domain reftruth.com
CNAME configured via GitHub Pages API; DNS (4 apex A records + www
CNAME) verified propagated. README now links the live tool; manuscript
updated in all four locations (contribution 3, section 2.7 text and
figure caption, Data and Code Availability).
</commit_message>
<xml_diff>
--- a/Manuscrito_Referencias_Alucinadas_v0.1.docx
+++ b/Manuscrito_Referencias_Alucinadas_v0.1.docx
@@ -251,7 +251,7 @@
           <w:i w:val="0"/>
           <w:sz w:val="22"/>
         </w:rPr>
-        <w:t>, we release the verification tool as a free web application (danielaristo.com/reference-integrity-checker), together with the annotated survivor set and all code and data, so that authors, editors, and reviewers can screen bibliographies before publication.</w:t>
+        <w:t>, we release the verification tool as a free web application (reftruth.com), together with the annotated survivor set and all code and data, so that authors, editors, and reviewers can screen bibliographies before publication.</w:t>
       </w:r>
     </w:p>
     <w:p>
@@ -581,7 +581,7 @@
           <w:i w:val="0"/>
           <w:sz w:val="22"/>
         </w:rPr>
-        <w:t>danielaristo.com/reference-integrity-checker</w:t>
+        <w:t>reftruth.com</w:t>
       </w:r>
       <w:r>
         <w:rPr>
@@ -643,7 +643,7 @@
           <w:color w:val="595959"/>
           <w:sz w:val="19"/>
         </w:rPr>
-        <w:t>Figure 1. The public web tool (danielaristo.com/reference-integrity-checker). References are pasted one per line; verification runs entirely client-side against Crossref and OpenAlex.</w:t>
+        <w:t>Figure 1. The public web tool (reftruth.com). References are pasted one per line; verification runs entirely client-side against Crossref and OpenAlex.</w:t>
       </w:r>
     </w:p>
     <w:p>
@@ -2561,7 +2561,7 @@
           <w:i w:val="0"/>
           <w:sz w:val="22"/>
         </w:rPr>
-        <w:t>danielaristo.com/reference-integrity-checker</w:t>
+        <w:t>reftruth.com</w:t>
       </w:r>
       <w:r>
         <w:rPr>

</xml_diff>

<commit_message>
Relocate Figure 2 and deployment-finding narrative from Methods to Discussion
Section 2.7 (Methods) now only describes the tool's architecture and the
verdict-taxonomy mapping (Table 3) -- what it is and how it works.
Section 4.1 (Discussion) now carries Figure 2 alongside the paragraph
that interprets it, so the rate-limit honesty finding reads as a
self-contained unit instead of splitting figure and interpretation
across sections.
</commit_message>
<xml_diff>
--- a/Manuscrito_Referencias_Alucinadas_v0.1.docx
+++ b/Manuscrito_Referencias_Alucinadas_v0.1.docx
@@ -1364,90 +1364,6 @@
           <w:i w:val="0"/>
           <w:sz w:val="22"/>
         </w:rPr>
-      </w:r>
-    </w:p>
-    <w:p>
-      <w:pPr>
-        <w:spacing w:before="120"/>
-        <w:jc w:val="center"/>
-      </w:pPr>
-      <w:r>
-        <w:drawing>
-          <wp:inline xmlns:a="http://schemas.openxmlformats.org/drawingml/2006/main" xmlns:pic="http://schemas.openxmlformats.org/drawingml/2006/picture">
-            <wp:extent cx="5120640" cy="3917172"/>
-            <wp:docPr id="2" name="Picture 2"/>
-            <wp:cNvGraphicFramePr>
-              <a:graphicFrameLocks noChangeAspect="1"/>
-            </wp:cNvGraphicFramePr>
-            <a:graphic>
-              <a:graphicData uri="http://schemas.openxmlformats.org/drawingml/2006/picture">
-                <pic:pic>
-                  <pic:nvPicPr>
-                    <pic:cNvPr id="0" name="captura_app_1.png"/>
-                    <pic:cNvPicPr/>
-                  </pic:nvPicPr>
-                  <pic:blipFill>
-                    <a:blip r:embed="rId10"/>
-                    <a:stretch>
-                      <a:fillRect/>
-                    </a:stretch>
-                  </pic:blipFill>
-                  <pic:spPr>
-                    <a:xfrm>
-                      <a:off x="0" y="0"/>
-                      <a:ext cx="5120640" cy="3917172"/>
-                    </a:xfrm>
-                    <a:prstGeom prst="rect"/>
-                  </pic:spPr>
-                </pic:pic>
-              </a:graphicData>
-            </a:graphic>
-          </wp:inline>
-        </w:drawing>
-      </w:r>
-    </w:p>
-    <w:p>
-      <w:pPr>
-        <w:spacing w:after="200"/>
-        <w:jc w:val="center"/>
-      </w:pPr>
-      <w:r>
-        <w:rPr>
-          <w:i/>
-          <w:color w:val="595959"/>
-          <w:sz w:val="19"/>
-        </w:rPr>
-        <w:t>Figure 2. Output of the public tool on the seven-reference test set of Section 2.3, captured during a period of sustained upstream rate limiting from OpenAlex. Rather than silently defaulting to a clean verdict, the tool reports explicitly that the retraction check could not be confirmed (see annotation under the first result) — the deployment finding discussed below.</w:t>
-      </w:r>
-    </w:p>
-    <w:p>
-      <w:pPr>
-        <w:spacing w:after="140"/>
-        <w:jc w:val="both"/>
-      </w:pPr>
-      <w:r>
-        <w:rPr>
-          <w:b w:val="0"/>
-          <w:i w:val="0"/>
-          <w:sz w:val="22"/>
-        </w:rPr>
-        <w:t xml:space="preserve">A deployment finding is worth reporting on its own terms. During live testing (Figure 2) we identified a failure mode in which a rate-limited (HTTP 429) response from OpenAlex was silently treated as a confirmed </w:t>
-      </w:r>
-      <w:r>
-        <w:rPr>
-          <w:b w:val="0"/>
-          <w:i/>
-          <w:sz w:val="22"/>
-        </w:rPr>
-        <w:t>not retracted</w:t>
-      </w:r>
-      <w:r>
-        <w:rPr>
-          <w:b w:val="0"/>
-          <w:i w:val="0"/>
-          <w:sz w:val="22"/>
-        </w:rPr>
-        <w:t xml:space="preserve"> result, rather than as a failed check — precisely the kind of false negative this study warns against. We revised the tool so that a failed retraction check is reported to the user explicitly ("retraction status could not be confirmed — verify manually") rather than defaulting to a clean verdict. We surface this not as a footnote but as a design principle: a screening tool must fail loudly, not silently, and we regard this fix as a direct, practical instantiation of the paper's central argument in Section 4.</w:t>
       </w:r>
     </w:p>
     <w:p>
@@ -2823,7 +2739,91 @@
           <w:i w:val="0"/>
           <w:sz w:val="22"/>
         </w:rPr>
-        <w:t xml:space="preserve"> as a confident verdict — as ours briefly did, before the fix described in Section 2.7 — reproduces at implementation level the exact conflation this paper argues against at the analytical level. Making that failure mode visible, and fixing it under real operating conditions (including genuine upstream rate limiting, not a simulated one), is evidence that the taxonomy proposed here is not only descriptively useful but operationally enforceable.</w:t>
+        <w:t xml:space="preserve"> as a confident verdict reproduces at implementation level the exact conflation this paper argues against at the analytical level — and, briefly during development, ours did exactly that.</w:t>
+      </w:r>
+    </w:p>
+    <w:p>
+      <w:pPr>
+        <w:spacing w:before="120"/>
+        <w:jc w:val="center"/>
+      </w:pPr>
+      <w:r>
+        <w:drawing>
+          <wp:inline xmlns:a="http://schemas.openxmlformats.org/drawingml/2006/main" xmlns:pic="http://schemas.openxmlformats.org/drawingml/2006/picture">
+            <wp:extent cx="5120640" cy="3917172"/>
+            <wp:docPr id="2" name="Picture 2"/>
+            <wp:cNvGraphicFramePr>
+              <a:graphicFrameLocks noChangeAspect="1"/>
+            </wp:cNvGraphicFramePr>
+            <a:graphic>
+              <a:graphicData uri="http://schemas.openxmlformats.org/drawingml/2006/picture">
+                <pic:pic>
+                  <pic:nvPicPr>
+                    <pic:cNvPr id="0" name="captura_app_1.png"/>
+                    <pic:cNvPicPr/>
+                  </pic:nvPicPr>
+                  <pic:blipFill>
+                    <a:blip r:embed="rId10"/>
+                    <a:stretch>
+                      <a:fillRect/>
+                    </a:stretch>
+                  </pic:blipFill>
+                  <pic:spPr>
+                    <a:xfrm>
+                      <a:off x="0" y="0"/>
+                      <a:ext cx="5120640" cy="3917172"/>
+                    </a:xfrm>
+                    <a:prstGeom prst="rect"/>
+                  </pic:spPr>
+                </pic:pic>
+              </a:graphicData>
+            </a:graphic>
+          </wp:inline>
+        </w:drawing>
+      </w:r>
+    </w:p>
+    <w:p>
+      <w:pPr>
+        <w:spacing w:after="200"/>
+        <w:jc w:val="center"/>
+      </w:pPr>
+      <w:r>
+        <w:rPr>
+          <w:i/>
+          <w:color w:val="595959"/>
+          <w:sz w:val="19"/>
+        </w:rPr>
+        <w:t>Figure 2. Output of the public tool on the seven-reference test set of Section 2.3, captured during a period of sustained upstream rate limiting from OpenAlex. Rather than silently defaulting to a clean verdict, the tool reports explicitly that the retraction check could not be confirmed (see annotation under the first result).</w:t>
+      </w:r>
+    </w:p>
+    <w:p>
+      <w:pPr>
+        <w:spacing w:after="140"/>
+        <w:jc w:val="both"/>
+      </w:pPr>
+      <w:r>
+        <w:rPr>
+          <w:b w:val="0"/>
+          <w:i w:val="0"/>
+          <w:sz w:val="22"/>
+        </w:rPr>
+        <w:t xml:space="preserve">During live testing (Figure 2) we identified a failure mode in which a rate-limited (HTTP 429) response from OpenAlex was silently treated as a confirmed </w:t>
+      </w:r>
+      <w:r>
+        <w:rPr>
+          <w:b w:val="0"/>
+          <w:i/>
+          <w:sz w:val="22"/>
+        </w:rPr>
+        <w:t>not retracted</w:t>
+      </w:r>
+      <w:r>
+        <w:rPr>
+          <w:b w:val="0"/>
+          <w:i w:val="0"/>
+          <w:sz w:val="22"/>
+        </w:rPr>
+        <w:t xml:space="preserve"> result, rather than as a failed check. We revised the tool so that a failed retraction check is reported to the user explicitly ("retraction status could not be confirmed — verify manually") rather than defaulting to a clean verdict. We surface this not as a footnote but as a design principle: a screening tool must fail loudly, not silently. Making this failure mode visible, and fixing it under real operating conditions rather than a simulated one, is evidence that the taxonomy proposed here is not only descriptively useful but operationally enforceable.</w:t>
       </w:r>
     </w:p>
     <w:p>

</xml_diff>